<commit_message>
Deploying to gh-pages from @ Morrison-Lab/wai@82436fb516f8d72f79bd5cb9a90d71e68731f1ac 🚀
</commit_message>
<xml_diff>
--- a/chapters/agent-orchestration.docx
+++ b/chapters/agent-orchestration.docx
@@ -15,7 +15,7 @@
         <w:pStyle w:val="Date"/>
       </w:pPr>
       <w:r>
-        <w:t xml:space="preserve">Last modified: 2026-09-10 20:52:53 (PDT)</w:t>
+        <w:t xml:space="preserve">Last modified: 2026-09-13 00:11:34 (PDT)</w:t>
       </w:r>
     </w:p>
     <w:p>
@@ -1907,13 +1907,774 @@
       </w:tr>
     </w:tbl>
     <w:bookmarkEnd w:id="34"/>
-    <w:bookmarkStart w:id="65" w:name="sec-orch-frameworks"/>
+    <w:bookmarkStart w:id="41" w:name="sec-ai-oh-my-opencode"/>
     <w:p>
       <w:pPr>
         <w:pStyle w:val="Heading1"/>
       </w:pPr>
       <w:r>
-        <w:t xml:space="preserve">6. Agent Orchestration Frameworks</w:t>
+        <w:t xml:space="preserve">6. Multi-Agent Orchestration with Oh My OpenCode / Oh My OpenAgent</w:t>
+      </w:r>
+    </w:p>
+    <w:p>
+      <w:pPr>
+        <w:pStyle w:val="FirstParagraph"/>
+      </w:pPr>
+      <w:hyperlink r:id="rId35">
+        <w:r>
+          <w:rPr>
+            <w:rStyle w:val="VerbatimChar"/>
+          </w:rPr>
+          <w:t xml:space="preserve">code-yeongyu/oh-my-openagent</w:t>
+        </w:r>
+      </w:hyperlink>
+      <w:r>
+        <w:t xml:space="preserve"> </w:t>
+      </w:r>
+      <w:r>
+        <w:t xml:space="preserve">(originally published as</w:t>
+      </w:r>
+      <w:r>
+        <w:t xml:space="preserve"> </w:t>
+      </w:r>
+      <w:r>
+        <w:rPr>
+          <w:b/>
+          <w:bCs/>
+        </w:rPr>
+        <w:t xml:space="preserve">Oh My OpenCode</w:t>
+      </w:r>
+      <w:r>
+        <w:t xml:space="preserve"> </w:t>
+      </w:r>
+      <w:r>
+        <w:t xml:space="preserve">or</w:t>
+      </w:r>
+      <w:r>
+        <w:t xml:space="preserve"> </w:t>
+      </w:r>
+      <w:r>
+        <w:rPr>
+          <w:rStyle w:val="VerbatimChar"/>
+        </w:rPr>
+        <w:t xml:space="preserve">omo</w:t>
+      </w:r>
+      <w:r>
+        <w:t xml:space="preserve">,</w:t>
+      </w:r>
+      <w:r>
+        <w:t xml:space="preserve"> </w:t>
+      </w:r>
+      <w:r>
+        <w:t xml:space="preserve">with community forks such as</w:t>
+      </w:r>
+      <w:r>
+        <w:t xml:space="preserve"> </w:t>
+      </w:r>
+      <w:hyperlink r:id="rId36">
+        <w:r>
+          <w:rPr>
+            <w:rStyle w:val="VerbatimChar"/>
+          </w:rPr>
+          <w:t xml:space="preserve">opensoft/oh-my-opencode</w:t>
+        </w:r>
+      </w:hyperlink>
+      <w:r>
+        <w:t xml:space="preserve">)</w:t>
+      </w:r>
+      <w:r>
+        <w:t xml:space="preserve"> </w:t>
+      </w:r>
+      <w:r>
+        <w:t xml:space="preserve">is an open-source multi-agent orchestration framework and plugin</w:t>
+      </w:r>
+      <w:r>
+        <w:t xml:space="preserve"> </w:t>
+      </w:r>
+      <w:r>
+        <w:t xml:space="preserve">for AI coding agent harnesses (including OpenCode and OpenAI Codex CLI)</w:t>
+      </w:r>
+      <w:r>
+        <w:t xml:space="preserve"> </w:t>
+      </w:r>
+      <w:r>
+        <w:t xml:space="preserve">with over 65,000 GitHub stars</w:t>
+      </w:r>
+      <w:r>
+        <w:t xml:space="preserve"> </w:t>
+      </w:r>
+      <w:r>
+        <w:t xml:space="preserve">(measured 2026-09-01).</w:t>
+      </w:r>
+      <w:r>
+        <w:t xml:space="preserve"> </w:t>
+      </w:r>
+      <w:r>
+        <w:t xml:space="preserve">Inspired by modular terminal configuration frameworks</w:t>
+      </w:r>
+      <w:r>
+        <w:t xml:space="preserve"> </w:t>
+      </w:r>
+      <w:r>
+        <w:t xml:space="preserve">(such as</w:t>
+      </w:r>
+      <w:r>
+        <w:t xml:space="preserve"> </w:t>
+      </w:r>
+      <w:hyperlink r:id="rId37">
+        <w:r>
+          <w:rPr>
+            <w:rStyle w:val="Hyperlink"/>
+          </w:rPr>
+          <w:t xml:space="preserve">Oh My Zsh</w:t>
+        </w:r>
+      </w:hyperlink>
+      <w:r>
+        <w:t xml:space="preserve">),</w:t>
+      </w:r>
+      <w:r>
+        <w:t xml:space="preserve"> </w:t>
+      </w:r>
+      <w:r>
+        <w:t xml:space="preserve">it expands single-agent coding into a specialized multi-agent system</w:t>
+      </w:r>
+      <w:r>
+        <w:t xml:space="preserve"> </w:t>
+      </w:r>
+      <w:r>
+        <w:t xml:space="preserve">with automated model routing and background task execution.</w:t>
+      </w:r>
+    </w:p>
+    <w:bookmarkStart w:id="38" w:name="hub-and-spoke-agent-architecture"/>
+    <w:p>
+      <w:pPr>
+        <w:pStyle w:val="Heading4"/>
+      </w:pPr>
+      <w:r>
+        <w:t xml:space="preserve">Hub-and-spoke agent architecture</w:t>
+      </w:r>
+    </w:p>
+    <w:p>
+      <w:pPr>
+        <w:pStyle w:val="FirstParagraph"/>
+      </w:pPr>
+      <w:r>
+        <w:t xml:space="preserve">Rather than relying on a single generalist agent to perform all research, design, coding, and review steps,</w:t>
+      </w:r>
+      <w:r>
+        <w:t xml:space="preserve"> </w:t>
+      </w:r>
+      <w:r>
+        <w:t xml:space="preserve">the framework implements a hub-and-spoke delegation model</w:t>
+      </w:r>
+      <w:r>
+        <w:t xml:space="preserve"> </w:t>
+      </w:r>
+      <w:r>
+        <w:t xml:space="preserve">with specialized agent personas:</w:t>
+      </w:r>
+    </w:p>
+    <w:p>
+      <w:pPr>
+        <w:pStyle w:val="Compact"/>
+        <w:numPr>
+          <w:ilvl w:val="0"/>
+          <w:numId w:val="1003"/>
+        </w:numPr>
+      </w:pPr>
+      <w:r>
+        <w:rPr>
+          <w:b/>
+          <w:bCs/>
+        </w:rPr>
+        <w:t xml:space="preserve">Sisyphus (Primary Orchestrator &amp; Task Lead)</w:t>
+      </w:r>
+      <w:r>
+        <w:t xml:space="preserve">:</w:t>
+      </w:r>
+      <w:r>
+        <w:t xml:space="preserve"> </w:t>
+      </w:r>
+      <w:r>
+        <w:t xml:space="preserve">Acts as the lead coordinator that breaks complex user requests into discrete work packages,</w:t>
+      </w:r>
+      <w:r>
+        <w:t xml:space="preserve"> </w:t>
+      </w:r>
+      <w:r>
+        <w:t xml:space="preserve">delegates subtasks to specialized agents, and aggregates results into a coherent solution.</w:t>
+      </w:r>
+    </w:p>
+    <w:p>
+      <w:pPr>
+        <w:pStyle w:val="Compact"/>
+        <w:numPr>
+          <w:ilvl w:val="0"/>
+          <w:numId w:val="1003"/>
+        </w:numPr>
+      </w:pPr>
+      <w:r>
+        <w:rPr>
+          <w:b/>
+          <w:bCs/>
+        </w:rPr>
+        <w:t xml:space="preserve">Prometheus (Strategic Planner)</w:t>
+      </w:r>
+      <w:r>
+        <w:t xml:space="preserve">:</w:t>
+      </w:r>
+      <w:r>
+        <w:t xml:space="preserve"> </w:t>
+      </w:r>
+      <w:r>
+        <w:t xml:space="preserve">Interviews the user to clarify scope and ambiguities,</w:t>
+      </w:r>
+      <w:r>
+        <w:t xml:space="preserve"> </w:t>
+      </w:r>
+      <w:r>
+        <w:t xml:space="preserve">formulating detailed implementation plans before code modifications begin.</w:t>
+      </w:r>
+    </w:p>
+    <w:p>
+      <w:pPr>
+        <w:pStyle w:val="Compact"/>
+        <w:numPr>
+          <w:ilvl w:val="0"/>
+          <w:numId w:val="1003"/>
+        </w:numPr>
+      </w:pPr>
+      <w:r>
+        <w:rPr>
+          <w:b/>
+          <w:bCs/>
+        </w:rPr>
+        <w:t xml:space="preserve">Metis (Pre-Planning Gap Analyzer)</w:t>
+      </w:r>
+      <w:r>
+        <w:t xml:space="preserve">:</w:t>
+      </w:r>
+      <w:r>
+        <w:t xml:space="preserve"> </w:t>
+      </w:r>
+      <w:r>
+        <w:t xml:space="preserve">Conducts pre-planning analysis alongside Prometheus to identify hidden requirements,</w:t>
+      </w:r>
+      <w:r>
+        <w:t xml:space="preserve"> </w:t>
+      </w:r>
+      <w:r>
+        <w:t xml:space="preserve">ambiguities, and potential failure points before plans are finalized.</w:t>
+      </w:r>
+    </w:p>
+    <w:p>
+      <w:pPr>
+        <w:pStyle w:val="Compact"/>
+        <w:numPr>
+          <w:ilvl w:val="0"/>
+          <w:numId w:val="1003"/>
+        </w:numPr>
+      </w:pPr>
+      <w:r>
+        <w:rPr>
+          <w:b/>
+          <w:bCs/>
+        </w:rPr>
+        <w:t xml:space="preserve">Momus (Plan Reviewer)</w:t>
+      </w:r>
+      <w:r>
+        <w:t xml:space="preserve">:</w:t>
+      </w:r>
+      <w:r>
+        <w:t xml:space="preserve"> </w:t>
+      </w:r>
+      <w:r>
+        <w:t xml:space="preserve">Validates proposed execution plans against clarity, verification,</w:t>
+      </w:r>
+      <w:r>
+        <w:t xml:space="preserve"> </w:t>
+      </w:r>
+      <w:r>
+        <w:t xml:space="preserve">and context criteria before execution.</w:t>
+      </w:r>
+    </w:p>
+    <w:p>
+      <w:pPr>
+        <w:pStyle w:val="Compact"/>
+        <w:numPr>
+          <w:ilvl w:val="0"/>
+          <w:numId w:val="1003"/>
+        </w:numPr>
+      </w:pPr>
+      <w:r>
+        <w:rPr>
+          <w:b/>
+          <w:bCs/>
+        </w:rPr>
+        <w:t xml:space="preserve">Atlas (Plan Executor)</w:t>
+      </w:r>
+      <w:r>
+        <w:t xml:space="preserve">:</w:t>
+      </w:r>
+      <w:r>
+        <w:t xml:space="preserve"> </w:t>
+      </w:r>
+      <w:r>
+        <w:t xml:space="preserve">Executes approved Prometheus plans step-by-step,</w:t>
+      </w:r>
+      <w:r>
+        <w:t xml:space="preserve"> </w:t>
+      </w:r>
+      <w:r>
+        <w:t xml:space="preserve">managing task progress and session continuity across execution sessions.</w:t>
+      </w:r>
+    </w:p>
+    <w:p>
+      <w:pPr>
+        <w:pStyle w:val="Compact"/>
+        <w:numPr>
+          <w:ilvl w:val="0"/>
+          <w:numId w:val="1003"/>
+        </w:numPr>
+      </w:pPr>
+      <w:r>
+        <w:rPr>
+          <w:b/>
+          <w:bCs/>
+        </w:rPr>
+        <w:t xml:space="preserve">Hephaestus (Autonomous Deep Worker)</w:t>
+      </w:r>
+      <w:r>
+        <w:t xml:space="preserve">:</w:t>
+      </w:r>
+      <w:r>
+        <w:t xml:space="preserve"> </w:t>
+      </w:r>
+      <w:r>
+        <w:t xml:space="preserve">Specializes in autonomous architectural refactoring and complex multi-file debugging.</w:t>
+      </w:r>
+    </w:p>
+    <w:p>
+      <w:pPr>
+        <w:pStyle w:val="Compact"/>
+        <w:numPr>
+          <w:ilvl w:val="0"/>
+          <w:numId w:val="1003"/>
+        </w:numPr>
+      </w:pPr>
+      <w:r>
+        <w:rPr>
+          <w:b/>
+          <w:bCs/>
+        </w:rPr>
+        <w:t xml:space="preserve">Oracle (Architecture &amp; Debugging Consultant)</w:t>
+      </w:r>
+      <w:r>
+        <w:t xml:space="preserve">:</w:t>
+      </w:r>
+      <w:r>
+        <w:t xml:space="preserve"> </w:t>
+      </w:r>
+      <w:r>
+        <w:t xml:space="preserve">Serves as a read-only architecture and deep debugging consultant,</w:t>
+      </w:r>
+      <w:r>
+        <w:t xml:space="preserve"> </w:t>
+      </w:r>
+      <w:r>
+        <w:t xml:space="preserve">analyzing system design trade-offs and diagnosing subtle runtime failures.</w:t>
+      </w:r>
+    </w:p>
+    <w:p>
+      <w:pPr>
+        <w:pStyle w:val="Compact"/>
+        <w:numPr>
+          <w:ilvl w:val="0"/>
+          <w:numId w:val="1003"/>
+        </w:numPr>
+      </w:pPr>
+      <w:r>
+        <w:rPr>
+          <w:b/>
+          <w:bCs/>
+        </w:rPr>
+        <w:t xml:space="preserve">Librarian (Documentation &amp; Code Search)</w:t>
+      </w:r>
+      <w:r>
+        <w:t xml:space="preserve">:</w:t>
+      </w:r>
+      <w:r>
+        <w:t xml:space="preserve"> </w:t>
+      </w:r>
+      <w:r>
+        <w:t xml:space="preserve">Conducts targeted external documentation lookups and code search</w:t>
+      </w:r>
+      <w:r>
+        <w:t xml:space="preserve"> </w:t>
+      </w:r>
+      <w:r>
+        <w:t xml:space="preserve">to supply focused context without bloating the orchestrator’s context window.</w:t>
+      </w:r>
+    </w:p>
+    <w:p>
+      <w:pPr>
+        <w:pStyle w:val="Compact"/>
+        <w:numPr>
+          <w:ilvl w:val="0"/>
+          <w:numId w:val="1003"/>
+        </w:numPr>
+      </w:pPr>
+      <w:r>
+        <w:rPr>
+          <w:b/>
+          <w:bCs/>
+        </w:rPr>
+        <w:t xml:space="preserve">Explore (Codebase Navigation &amp; Fast Grep)</w:t>
+      </w:r>
+      <w:r>
+        <w:t xml:space="preserve">:</w:t>
+      </w:r>
+      <w:r>
+        <w:t xml:space="preserve"> </w:t>
+      </w:r>
+      <w:r>
+        <w:t xml:space="preserve">Specializes in fast pattern searches, codebase navigation,</w:t>
+      </w:r>
+      <w:r>
+        <w:t xml:space="preserve"> </w:t>
+      </w:r>
+      <w:r>
+        <w:t xml:space="preserve">and file structure discovery.</w:t>
+      </w:r>
+    </w:p>
+    <w:bookmarkEnd w:id="38"/>
+    <w:bookmarkStart w:id="39" w:name="heterogeneous-model-routing"/>
+    <w:p>
+      <w:pPr>
+        <w:pStyle w:val="Heading4"/>
+      </w:pPr>
+      <w:r>
+        <w:t xml:space="preserve">Heterogeneous model routing</w:t>
+      </w:r>
+    </w:p>
+    <w:p>
+      <w:pPr>
+        <w:pStyle w:val="FirstParagraph"/>
+      </w:pPr>
+      <w:r>
+        <w:t xml:space="preserve">A central capability of the framework is decoupling agent roles from a single model provider.</w:t>
+      </w:r>
+      <w:r>
+        <w:t xml:space="preserve"> </w:t>
+      </w:r>
+      <w:r>
+        <w:t xml:space="preserve">Developers can route distinct tasks to the model family best suited for each workload:</w:t>
+      </w:r>
+    </w:p>
+    <w:p>
+      <w:pPr>
+        <w:pStyle w:val="Compact"/>
+        <w:numPr>
+          <w:ilvl w:val="0"/>
+          <w:numId w:val="1004"/>
+        </w:numPr>
+      </w:pPr>
+      <w:r>
+        <w:rPr>
+          <w:b/>
+          <w:bCs/>
+        </w:rPr>
+        <w:t xml:space="preserve">High-reasoning tiers</w:t>
+      </w:r>
+      <w:r>
+        <w:t xml:space="preserve"> </w:t>
+      </w:r>
+      <w:r>
+        <w:t xml:space="preserve">(such as Anthropic Claude Sonnet or Opus) for architectural planning and deep refactoring.</w:t>
+      </w:r>
+    </w:p>
+    <w:p>
+      <w:pPr>
+        <w:pStyle w:val="Compact"/>
+        <w:numPr>
+          <w:ilvl w:val="0"/>
+          <w:numId w:val="1004"/>
+        </w:numPr>
+      </w:pPr>
+      <w:r>
+        <w:rPr>
+          <w:b/>
+          <w:bCs/>
+        </w:rPr>
+        <w:t xml:space="preserve">High-throughput models</w:t>
+      </w:r>
+      <w:r>
+        <w:t xml:space="preserve"> </w:t>
+      </w:r>
+      <w:r>
+        <w:t xml:space="preserve">(such as OpenAI GPT models) for rapid code generation and unit testing.</w:t>
+      </w:r>
+    </w:p>
+    <w:p>
+      <w:pPr>
+        <w:pStyle w:val="Compact"/>
+        <w:numPr>
+          <w:ilvl w:val="0"/>
+          <w:numId w:val="1004"/>
+        </w:numPr>
+      </w:pPr>
+      <w:r>
+        <w:rPr>
+          <w:b/>
+          <w:bCs/>
+        </w:rPr>
+        <w:t xml:space="preserve">Large-context models</w:t>
+      </w:r>
+      <w:r>
+        <w:t xml:space="preserve"> </w:t>
+      </w:r>
+      <w:r>
+        <w:t xml:space="preserve">(such as Google Gemini) for extensive repository research and multi-file context indexing.</w:t>
+      </w:r>
+    </w:p>
+    <w:bookmarkEnd w:id="39"/>
+    <w:bookmarkStart w:id="40" w:name="operational-capabilities"/>
+    <w:p>
+      <w:pPr>
+        <w:pStyle w:val="Heading4"/>
+      </w:pPr>
+      <w:r>
+        <w:t xml:space="preserve">Operational capabilities</w:t>
+      </w:r>
+    </w:p>
+    <w:tbl>
+      <w:tblPr>
+        <w:tblStyle w:val="Table"/>
+        <w:tblW w:type="pct" w:w="5000"/>
+        <w:tblLayout w:type="fixed"/>
+        <w:tblLook w:firstRow="1" w:lastRow="0" w:firstColumn="0" w:lastColumn="0" w:noHBand="0" w:noVBand="0" w:val="0020"/>
+      </w:tblPr>
+      <w:tblGrid>
+        <w:gridCol w:w="2640"/>
+        <w:gridCol w:w="2640"/>
+        <w:gridCol w:w="2640"/>
+      </w:tblGrid>
+      <w:tr>
+        <w:trPr>
+          <w:tblHeader w:val="on"/>
+        </w:trPr>
+        <w:tc>
+          <w:tcPr/>
+          <w:p>
+            <w:pPr>
+              <w:pStyle w:val="Compact"/>
+            </w:pPr>
+            <w:r>
+              <w:t xml:space="preserve">Dimension</w:t>
+            </w:r>
+          </w:p>
+        </w:tc>
+        <w:tc>
+          <w:tcPr/>
+          <w:p>
+            <w:pPr>
+              <w:pStyle w:val="Compact"/>
+            </w:pPr>
+            <w:r>
+              <w:t xml:space="preserve">Standard OpenCode</w:t>
+            </w:r>
+          </w:p>
+        </w:tc>
+        <w:tc>
+          <w:tcPr/>
+          <w:p>
+            <w:pPr>
+              <w:pStyle w:val="Compact"/>
+            </w:pPr>
+            <w:r>
+              <w:t xml:space="preserve">Oh My OpenCode / Oh My OpenAgent</w:t>
+            </w:r>
+          </w:p>
+        </w:tc>
+      </w:tr>
+      <w:tr>
+        <w:tc>
+          <w:tcPr/>
+          <w:p>
+            <w:pPr>
+              <w:pStyle w:val="Compact"/>
+            </w:pPr>
+            <w:r>
+              <w:rPr>
+                <w:b/>
+                <w:bCs/>
+              </w:rPr>
+              <w:t xml:space="preserve">Agent topology</w:t>
+            </w:r>
+          </w:p>
+        </w:tc>
+        <w:tc>
+          <w:tcPr/>
+          <w:p>
+            <w:pPr>
+              <w:pStyle w:val="Compact"/>
+            </w:pPr>
+            <w:r>
+              <w:t xml:space="preserve">Single sequential agent loop</w:t>
+            </w:r>
+          </w:p>
+        </w:tc>
+        <w:tc>
+          <w:tcPr/>
+          <w:p>
+            <w:pPr>
+              <w:pStyle w:val="Compact"/>
+            </w:pPr>
+            <w:r>
+              <w:t xml:space="preserve">Hub-and-spoke multi-agent team</w:t>
+            </w:r>
+          </w:p>
+        </w:tc>
+      </w:tr>
+      <w:tr>
+        <w:tc>
+          <w:tcPr/>
+          <w:p>
+            <w:pPr>
+              <w:pStyle w:val="Compact"/>
+            </w:pPr>
+            <w:r>
+              <w:rPr>
+                <w:b/>
+                <w:bCs/>
+              </w:rPr>
+              <w:t xml:space="preserve">Model routing</w:t>
+            </w:r>
+          </w:p>
+        </w:tc>
+        <w:tc>
+          <w:tcPr/>
+          <w:p>
+            <w:pPr>
+              <w:pStyle w:val="Compact"/>
+            </w:pPr>
+            <w:r>
+              <w:t xml:space="preserve">Single active model per session</w:t>
+            </w:r>
+          </w:p>
+        </w:tc>
+        <w:tc>
+          <w:tcPr/>
+          <w:p>
+            <w:pPr>
+              <w:pStyle w:val="Compact"/>
+            </w:pPr>
+            <w:r>
+              <w:t xml:space="preserve">Dynamic per-agent model assignment</w:t>
+            </w:r>
+          </w:p>
+        </w:tc>
+      </w:tr>
+      <w:tr>
+        <w:tc>
+          <w:tcPr/>
+          <w:p>
+            <w:pPr>
+              <w:pStyle w:val="Compact"/>
+            </w:pPr>
+            <w:r>
+              <w:rPr>
+                <w:b/>
+                <w:bCs/>
+              </w:rPr>
+              <w:t xml:space="preserve">Execution monitoring</w:t>
+            </w:r>
+          </w:p>
+        </w:tc>
+        <w:tc>
+          <w:tcPr/>
+          <w:p>
+            <w:pPr>
+              <w:pStyle w:val="Compact"/>
+            </w:pPr>
+            <w:r>
+              <w:t xml:space="preserve">Standard terminal output</w:t>
+            </w:r>
+          </w:p>
+        </w:tc>
+        <w:tc>
+          <w:tcPr/>
+          <w:p>
+            <w:pPr>
+              <w:pStyle w:val="Compact"/>
+            </w:pPr>
+            <w:r>
+              <w:t xml:space="preserve">Interactive</w:t>
+            </w:r>
+            <w:r>
+              <w:t xml:space="preserve"> </w:t>
+            </w:r>
+            <w:r>
+              <w:rPr>
+                <w:rStyle w:val="VerbatimChar"/>
+              </w:rPr>
+              <w:t xml:space="preserve">tmux</w:t>
+            </w:r>
+            <w:r>
+              <w:t xml:space="preserve">-backed session management</w:t>
+            </w:r>
+          </w:p>
+        </w:tc>
+      </w:tr>
+      <w:tr>
+        <w:tc>
+          <w:tcPr/>
+          <w:p>
+            <w:pPr>
+              <w:pStyle w:val="Compact"/>
+            </w:pPr>
+            <w:r>
+              <w:rPr>
+                <w:b/>
+                <w:bCs/>
+              </w:rPr>
+              <w:t xml:space="preserve">Extensibility</w:t>
+            </w:r>
+          </w:p>
+        </w:tc>
+        <w:tc>
+          <w:tcPr/>
+          <w:p>
+            <w:pPr>
+              <w:pStyle w:val="Compact"/>
+            </w:pPr>
+            <w:r>
+              <w:t xml:space="preserve">Individual plugins and MCPs</w:t>
+            </w:r>
+          </w:p>
+        </w:tc>
+        <w:tc>
+          <w:tcPr/>
+          <w:p>
+            <w:pPr>
+              <w:pStyle w:val="Compact"/>
+            </w:pPr>
+            <w:r>
+              <w:t xml:space="preserve">Curated bundle of tools, agents, and MCP integrations</w:t>
+            </w:r>
+          </w:p>
+        </w:tc>
+      </w:tr>
+    </w:tbl>
+    <w:bookmarkEnd w:id="40"/>
+    <w:bookmarkEnd w:id="41"/>
+    <w:bookmarkStart w:id="72" w:name="sec-orch-frameworks"/>
+    <w:p>
+      <w:pPr>
+        <w:pStyle w:val="Heading1"/>
+      </w:pPr>
+      <w:r>
+        <w:t xml:space="preserve">7. Agent Orchestration Frameworks</w:t>
       </w:r>
     </w:p>
     <w:p>
@@ -2110,20 +2871,20 @@
         <w:t xml:space="preserve">and will drift.</w:t>
       </w:r>
     </w:p>
-    <w:bookmarkStart w:id="38" w:name="sec-orch-autogen"/>
+    <w:bookmarkStart w:id="45" w:name="sec-orch-autogen"/>
     <w:p>
       <w:pPr>
         <w:pStyle w:val="Heading2"/>
       </w:pPr>
       <w:r>
-        <w:t xml:space="preserve">6.1 Microsoft AutoGen</w:t>
+        <w:t xml:space="preserve">7.1 Microsoft AutoGen</w:t>
       </w:r>
     </w:p>
     <w:p>
       <w:pPr>
         <w:pStyle w:val="FirstParagraph"/>
       </w:pPr>
-      <w:hyperlink r:id="rId35">
+      <w:hyperlink r:id="rId42">
         <w:r>
           <w:rPr>
             <w:rStyle w:val="Hyperlink"/>
@@ -2161,7 +2922,7 @@
         <w:pStyle w:val="Compact"/>
         <w:numPr>
           <w:ilvl w:val="0"/>
-          <w:numId w:val="1003"/>
+          <w:numId w:val="1005"/>
         </w:numPr>
       </w:pPr>
       <w:r>
@@ -2179,7 +2940,7 @@
         <w:pStyle w:val="Compact"/>
         <w:numPr>
           <w:ilvl w:val="0"/>
-          <w:numId w:val="1003"/>
+          <w:numId w:val="1005"/>
         </w:numPr>
       </w:pPr>
       <w:r>
@@ -2234,7 +2995,7 @@
         <w:pStyle w:val="Compact"/>
         <w:numPr>
           <w:ilvl w:val="0"/>
-          <w:numId w:val="1003"/>
+          <w:numId w:val="1005"/>
         </w:numPr>
       </w:pPr>
       <w:r>
@@ -2252,7 +3013,7 @@
         <w:pStyle w:val="Compact"/>
         <w:numPr>
           <w:ilvl w:val="0"/>
-          <w:numId w:val="1003"/>
+          <w:numId w:val="1005"/>
         </w:numPr>
       </w:pPr>
       <w:r>
@@ -2450,12 +3211,12 @@
                 <wp:inline>
                   <wp:extent cx="152400" cy="152400"/>
                   <wp:effectExtent b="0" l="0" r="0" t="0"/>
-                  <wp:docPr descr="" title="" id="36" name="Picture"/>
+                  <wp:docPr descr="" title="" id="43" name="Picture"/>
                   <a:graphic>
                     <a:graphicData uri="http://schemas.openxmlformats.org/drawingml/2006/picture">
                       <pic:pic>
                         <pic:nvPicPr>
-                          <pic:cNvPr descr="/opt/quarto/share/formats/docx/note.png" id="37" name="Picture"/>
+                          <pic:cNvPr descr="/opt/quarto/share/formats/docx/note.png" id="44" name="Picture"/>
                           <pic:cNvPicPr>
                             <a:picLocks noChangeArrowheads="1" noChangeAspect="1"/>
                           </pic:cNvPicPr>
@@ -2570,14 +3331,14 @@
         </w:tc>
       </w:tr>
     </w:tbl>
-    <w:bookmarkEnd w:id="38"/>
-    <w:bookmarkStart w:id="42" w:name="sec-orch-maf"/>
+    <w:bookmarkEnd w:id="45"/>
+    <w:bookmarkStart w:id="49" w:name="sec-orch-maf"/>
     <w:p>
       <w:pPr>
         <w:pStyle w:val="Heading2"/>
       </w:pPr>
       <w:r>
-        <w:t xml:space="preserve">6.2 Microsoft Agent Framework</w:t>
+        <w:t xml:space="preserve">7.2 Microsoft Agent Framework</w:t>
       </w:r>
     </w:p>
     <w:p>
@@ -2590,7 +3351,7 @@
       <w:r>
         <w:t xml:space="preserve"> </w:t>
       </w:r>
-      <w:hyperlink r:id="rId39">
+      <w:hyperlink r:id="rId46">
         <w:r>
           <w:rPr>
             <w:rStyle w:val="Hyperlink"/>
@@ -2762,12 +3523,12 @@
                 <wp:inline>
                   <wp:extent cx="152400" cy="152400"/>
                   <wp:effectExtent b="0" l="0" r="0" t="0"/>
-                  <wp:docPr descr="" title="" id="40" name="Picture"/>
+                  <wp:docPr descr="" title="" id="47" name="Picture"/>
                   <a:graphic>
                     <a:graphicData uri="http://schemas.openxmlformats.org/drawingml/2006/picture">
                       <pic:pic>
                         <pic:nvPicPr>
-                          <pic:cNvPr descr="/opt/quarto/share/formats/docx/note.png" id="41" name="Picture"/>
+                          <pic:cNvPr descr="/opt/quarto/share/formats/docx/note.png" id="48" name="Picture"/>
                           <pic:cNvPicPr>
                             <a:picLocks noChangeArrowheads="1" noChangeAspect="1"/>
                           </pic:cNvPicPr>
@@ -2891,21 +3652,21 @@
         </w:tc>
       </w:tr>
     </w:tbl>
-    <w:bookmarkEnd w:id="42"/>
-    <w:bookmarkStart w:id="46" w:name="sec-orch-langgraph"/>
+    <w:bookmarkEnd w:id="49"/>
+    <w:bookmarkStart w:id="53" w:name="sec-orch-langgraph"/>
     <w:p>
       <w:pPr>
         <w:pStyle w:val="Heading2"/>
       </w:pPr>
       <w:r>
-        <w:t xml:space="preserve">6.3 LangGraph</w:t>
+        <w:t xml:space="preserve">7.3 LangGraph</w:t>
       </w:r>
     </w:p>
     <w:p>
       <w:pPr>
         <w:pStyle w:val="FirstParagraph"/>
       </w:pPr>
-      <w:hyperlink r:id="rId43">
+      <w:hyperlink r:id="rId50">
         <w:r>
           <w:rPr>
             <w:rStyle w:val="Hyperlink"/>
@@ -3113,12 +3874,12 @@
                 <wp:inline>
                   <wp:extent cx="152400" cy="152400"/>
                   <wp:effectExtent b="0" l="0" r="0" t="0"/>
-                  <wp:docPr descr="" title="" id="44" name="Picture"/>
+                  <wp:docPr descr="" title="" id="51" name="Picture"/>
                   <a:graphic>
                     <a:graphicData uri="http://schemas.openxmlformats.org/drawingml/2006/picture">
                       <pic:pic>
                         <pic:nvPicPr>
-                          <pic:cNvPr descr="/opt/quarto/share/formats/docx/tip.png" id="45" name="Picture"/>
+                          <pic:cNvPr descr="/opt/quarto/share/formats/docx/tip.png" id="52" name="Picture"/>
                           <pic:cNvPicPr>
                             <a:picLocks noChangeArrowheads="1" noChangeAspect="1"/>
                           </pic:cNvPicPr>
@@ -3245,21 +4006,21 @@
         </w:tc>
       </w:tr>
     </w:tbl>
-    <w:bookmarkEnd w:id="46"/>
-    <w:bookmarkStart w:id="50" w:name="sec-orch-crewai"/>
+    <w:bookmarkEnd w:id="53"/>
+    <w:bookmarkStart w:id="57" w:name="sec-orch-crewai"/>
     <w:p>
       <w:pPr>
         <w:pStyle w:val="Heading2"/>
       </w:pPr>
       <w:r>
-        <w:t xml:space="preserve">6.4 CrewAI</w:t>
+        <w:t xml:space="preserve">7.4 CrewAI</w:t>
       </w:r>
     </w:p>
     <w:p>
       <w:pPr>
         <w:pStyle w:val="FirstParagraph"/>
       </w:pPr>
-      <w:hyperlink r:id="rId47">
+      <w:hyperlink r:id="rId54">
         <w:r>
           <w:rPr>
             <w:rStyle w:val="Hyperlink"/>
@@ -3472,12 +4233,12 @@
                 <wp:inline>
                   <wp:extent cx="152400" cy="152400"/>
                   <wp:effectExtent b="0" l="0" r="0" t="0"/>
-                  <wp:docPr descr="" title="" id="48" name="Picture"/>
+                  <wp:docPr descr="" title="" id="55" name="Picture"/>
                   <a:graphic>
                     <a:graphicData uri="http://schemas.openxmlformats.org/drawingml/2006/picture">
                       <pic:pic>
                         <pic:nvPicPr>
-                          <pic:cNvPr descr="/opt/quarto/share/formats/docx/note.png" id="49" name="Picture"/>
+                          <pic:cNvPr descr="/opt/quarto/share/formats/docx/note.png" id="56" name="Picture"/>
                           <pic:cNvPicPr>
                             <a:picLocks noChangeArrowheads="1" noChangeAspect="1"/>
                           </pic:cNvPicPr>
@@ -3571,14 +4332,14 @@
         </w:tc>
       </w:tr>
     </w:tbl>
-    <w:bookmarkEnd w:id="50"/>
-    <w:bookmarkStart w:id="54" w:name="sec-orch-openai-agents"/>
+    <w:bookmarkEnd w:id="57"/>
+    <w:bookmarkStart w:id="61" w:name="sec-orch-openai-agents"/>
     <w:p>
       <w:pPr>
         <w:pStyle w:val="Heading2"/>
       </w:pPr>
       <w:r>
-        <w:t xml:space="preserve">6.5 OpenAI Agents SDK</w:t>
+        <w:t xml:space="preserve">7.5 OpenAI Agents SDK</w:t>
       </w:r>
     </w:p>
     <w:p>
@@ -3591,7 +4352,7 @@
       <w:r>
         <w:t xml:space="preserve"> </w:t>
       </w:r>
-      <w:hyperlink r:id="rId51">
+      <w:hyperlink r:id="rId58">
         <w:r>
           <w:rPr>
             <w:rStyle w:val="Hyperlink"/>
@@ -3799,12 +4560,12 @@
                 <wp:inline>
                   <wp:extent cx="152400" cy="152400"/>
                   <wp:effectExtent b="0" l="0" r="0" t="0"/>
-                  <wp:docPr descr="" title="" id="52" name="Picture"/>
+                  <wp:docPr descr="" title="" id="59" name="Picture"/>
                   <a:graphic>
                     <a:graphicData uri="http://schemas.openxmlformats.org/drawingml/2006/picture">
                       <pic:pic>
                         <pic:nvPicPr>
-                          <pic:cNvPr descr="/opt/quarto/share/formats/docx/note.png" id="53" name="Picture"/>
+                          <pic:cNvPr descr="/opt/quarto/share/formats/docx/note.png" id="60" name="Picture"/>
                           <pic:cNvPicPr>
                             <a:picLocks noChangeArrowheads="1" noChangeAspect="1"/>
                           </pic:cNvPicPr>
@@ -3898,14 +4659,14 @@
         </w:tc>
       </w:tr>
     </w:tbl>
-    <w:bookmarkEnd w:id="54"/>
-    <w:bookmarkStart w:id="58" w:name="sec-orch-adk"/>
+    <w:bookmarkEnd w:id="61"/>
+    <w:bookmarkStart w:id="65" w:name="sec-orch-adk"/>
     <w:p>
       <w:pPr>
         <w:pStyle w:val="Heading2"/>
       </w:pPr>
       <w:r>
-        <w:t xml:space="preserve">6.6 Google Agent Development Kit</w:t>
+        <w:t xml:space="preserve">7.6 Google Agent Development Kit</w:t>
       </w:r>
     </w:p>
     <w:p>
@@ -3918,7 +4679,7 @@
       <w:r>
         <w:t xml:space="preserve"> </w:t>
       </w:r>
-      <w:hyperlink r:id="rId55">
+      <w:hyperlink r:id="rId62">
         <w:r>
           <w:rPr>
             <w:rStyle w:val="Hyperlink"/>
@@ -4121,12 +4882,12 @@
                 <wp:inline>
                   <wp:extent cx="152400" cy="152400"/>
                   <wp:effectExtent b="0" l="0" r="0" t="0"/>
-                  <wp:docPr descr="" title="" id="56" name="Picture"/>
+                  <wp:docPr descr="" title="" id="63" name="Picture"/>
                   <a:graphic>
                     <a:graphicData uri="http://schemas.openxmlformats.org/drawingml/2006/picture">
                       <pic:pic>
                         <pic:nvPicPr>
-                          <pic:cNvPr descr="/opt/quarto/share/formats/docx/note.png" id="57" name="Picture"/>
+                          <pic:cNvPr descr="/opt/quarto/share/formats/docx/note.png" id="64" name="Picture"/>
                           <pic:cNvPicPr>
                             <a:picLocks noChangeArrowheads="1" noChangeAspect="1"/>
                           </pic:cNvPicPr>
@@ -4214,14 +4975,14 @@
         </w:tc>
       </w:tr>
     </w:tbl>
-    <w:bookmarkEnd w:id="58"/>
-    <w:bookmarkStart w:id="64" w:name="sec-orch-others"/>
+    <w:bookmarkEnd w:id="65"/>
+    <w:bookmarkStart w:id="71" w:name="sec-orch-others"/>
     <w:p>
       <w:pPr>
         <w:pStyle w:val="Heading2"/>
       </w:pPr>
       <w:r>
-        <w:t xml:space="preserve">6.7 Others</w:t>
+        <w:t xml:space="preserve">7.7 Others</w:t>
       </w:r>
     </w:p>
     <w:p>
@@ -4255,10 +5016,10 @@
         <w:pStyle w:val="Compact"/>
         <w:numPr>
           <w:ilvl w:val="0"/>
-          <w:numId w:val="1004"/>
+          <w:numId w:val="1006"/>
         </w:numPr>
       </w:pPr>
-      <w:hyperlink r:id="rId59">
+      <w:hyperlink r:id="rId66">
         <w:r>
           <w:rPr>
             <w:rStyle w:val="VerbatimChar"/>
@@ -4326,10 +5087,10 @@
         <w:pStyle w:val="Compact"/>
         <w:numPr>
           <w:ilvl w:val="0"/>
-          <w:numId w:val="1004"/>
+          <w:numId w:val="1006"/>
         </w:numPr>
       </w:pPr>
-      <w:hyperlink r:id="rId60">
+      <w:hyperlink r:id="rId67">
         <w:r>
           <w:rPr>
             <w:rStyle w:val="VerbatimChar"/>
@@ -4364,10 +5125,10 @@
         <w:pStyle w:val="Compact"/>
         <w:numPr>
           <w:ilvl w:val="0"/>
-          <w:numId w:val="1004"/>
+          <w:numId w:val="1006"/>
         </w:numPr>
       </w:pPr>
-      <w:hyperlink r:id="rId61">
+      <w:hyperlink r:id="rId68">
         <w:r>
           <w:rPr>
             <w:rStyle w:val="VerbatimChar"/>
@@ -4402,10 +5163,10 @@
         <w:pStyle w:val="Compact"/>
         <w:numPr>
           <w:ilvl w:val="0"/>
-          <w:numId w:val="1004"/>
+          <w:numId w:val="1006"/>
         </w:numPr>
       </w:pPr>
-      <w:hyperlink r:id="rId62">
+      <w:hyperlink r:id="rId69">
         <w:r>
           <w:rPr>
             <w:rStyle w:val="VerbatimChar"/>
@@ -4455,10 +5216,10 @@
         <w:pStyle w:val="Compact"/>
         <w:numPr>
           <w:ilvl w:val="0"/>
-          <w:numId w:val="1004"/>
+          <w:numId w:val="1006"/>
         </w:numPr>
       </w:pPr>
-      <w:hyperlink r:id="rId63">
+      <w:hyperlink r:id="rId70">
         <w:r>
           <w:rPr>
             <w:rStyle w:val="VerbatimChar"/>
@@ -4493,7 +5254,7 @@
         <w:pStyle w:val="Compact"/>
         <w:numPr>
           <w:ilvl w:val="0"/>
-          <w:numId w:val="1004"/>
+          <w:numId w:val="1006"/>
         </w:numPr>
       </w:pPr>
       <w:r>
@@ -4512,15 +5273,15 @@
         <w:t xml:space="preserve">of this site’s repository.</w:t>
       </w:r>
     </w:p>
-    <w:bookmarkEnd w:id="64"/>
-    <w:bookmarkEnd w:id="65"/>
-    <w:bookmarkStart w:id="66" w:name="sec-orch-comparison"/>
+    <w:bookmarkEnd w:id="71"/>
+    <w:bookmarkEnd w:id="72"/>
+    <w:bookmarkStart w:id="73" w:name="sec-orch-comparison"/>
     <w:p>
       <w:pPr>
         <w:pStyle w:val="Heading1"/>
       </w:pPr>
       <w:r>
-        <w:t xml:space="preserve">7. Comparison</w:t>
+        <w:t xml:space="preserve">8. Comparison</w:t>
       </w:r>
     </w:p>
     <w:p>
@@ -5122,7 +5883,7 @@
           <w:rPr>
             <w:rStyle w:val="Hyperlink"/>
           </w:rPr>
-          <w:t xml:space="preserve">Section 6</w:t>
+          <w:t xml:space="preserve">Section 7</w:t>
         </w:r>
       </w:hyperlink>
       <w:r>
@@ -5189,14 +5950,14 @@
         <w:t xml:space="preserve">if a durable Python pipeline with human sign-off ever becomes a lab need.</w:t>
       </w:r>
     </w:p>
-    <w:bookmarkEnd w:id="66"/>
-    <w:bookmarkStart w:id="67" w:name="sec-orch-recommendation"/>
+    <w:bookmarkEnd w:id="73"/>
+    <w:bookmarkStart w:id="74" w:name="sec-orch-recommendation"/>
     <w:p>
       <w:pPr>
         <w:pStyle w:val="Heading1"/>
       </w:pPr>
       <w:r>
-        <w:t xml:space="preserve">8. Recommendation</w:t>
+        <w:t xml:space="preserve">9. Recommendation</w:t>
       </w:r>
     </w:p>
     <w:p>
@@ -5211,7 +5972,7 @@
       <w:pPr>
         <w:numPr>
           <w:ilvl w:val="0"/>
-          <w:numId w:val="1005"/>
+          <w:numId w:val="1007"/>
         </w:numPr>
       </w:pPr>
       <w:r>
@@ -5250,7 +6011,7 @@
       <w:pPr>
         <w:numPr>
           <w:ilvl w:val="0"/>
-          <w:numId w:val="1005"/>
+          <w:numId w:val="1007"/>
         </w:numPr>
       </w:pPr>
       <w:r>
@@ -5289,7 +6050,7 @@
       <w:pPr>
         <w:numPr>
           <w:ilvl w:val="0"/>
-          <w:numId w:val="1005"/>
+          <w:numId w:val="1007"/>
         </w:numPr>
       </w:pPr>
       <w:r>
@@ -5322,7 +6083,7 @@
       <w:pPr>
         <w:numPr>
           <w:ilvl w:val="0"/>
-          <w:numId w:val="1005"/>
+          <w:numId w:val="1007"/>
         </w:numPr>
       </w:pPr>
       <w:r>
@@ -5346,7 +6107,7 @@
           <w:rPr>
             <w:rStyle w:val="Hyperlink"/>
           </w:rPr>
-          <w:t xml:space="preserve">Section 6</w:t>
+          <w:t xml:space="preserve">Section 7</w:t>
         </w:r>
       </w:hyperlink>
       <w:r>
@@ -5403,8 +6164,8 @@
         <w:t xml:space="preserve">and TORQCLAW is, for now, only a reference.</w:t>
       </w:r>
     </w:p>
-    <w:bookmarkEnd w:id="67"/>
-    <w:bookmarkStart w:id="91" w:name="references"/>
+    <w:bookmarkEnd w:id="74"/>
+    <w:bookmarkStart w:id="98" w:name="references"/>
     <w:p>
       <w:pPr>
         <w:pStyle w:val="Heading1"/>
@@ -5413,8 +6174,8 @@
         <w:t xml:space="preserve">References</w:t>
       </w:r>
     </w:p>
-    <w:bookmarkStart w:id="90" w:name="refs"/>
-    <w:bookmarkStart w:id="68" w:name="ref-claude_agent_teams"/>
+    <w:bookmarkStart w:id="97" w:name="refs"/>
+    <w:bookmarkStart w:id="75" w:name="ref-claude_agent_teams"/>
     <w:p>
       <w:pPr>
         <w:pStyle w:val="Bibliography"/>
@@ -5450,8 +6211,8 @@
         <w:t xml:space="preserve">.</w:t>
       </w:r>
     </w:p>
-    <w:bookmarkEnd w:id="68"/>
-    <w:bookmarkStart w:id="69" w:name="ref-camel_ai"/>
+    <w:bookmarkEnd w:id="75"/>
+    <w:bookmarkStart w:id="76" w:name="ref-camel_ai"/>
     <w:p>
       <w:pPr>
         <w:pStyle w:val="Bibliography"/>
@@ -5475,7 +6236,7 @@
       <w:r>
         <w:t xml:space="preserve"> </w:t>
       </w:r>
-      <w:hyperlink r:id="rId63">
+      <w:hyperlink r:id="rId70">
         <w:r>
           <w:rPr>
             <w:rStyle w:val="Hyperlink"/>
@@ -5487,8 +6248,8 @@
         <w:t xml:space="preserve">.</w:t>
       </w:r>
     </w:p>
-    <w:bookmarkEnd w:id="69"/>
-    <w:bookmarkStart w:id="71" w:name="ref-crewai_repo"/>
+    <w:bookmarkEnd w:id="76"/>
+    <w:bookmarkStart w:id="78" w:name="ref-crewai_repo"/>
     <w:p>
       <w:pPr>
         <w:pStyle w:val="Bibliography"/>
@@ -5512,7 +6273,7 @@
       <w:r>
         <w:t xml:space="preserve"> </w:t>
       </w:r>
-      <w:hyperlink r:id="rId70">
+      <w:hyperlink r:id="rId77">
         <w:r>
           <w:rPr>
             <w:rStyle w:val="Hyperlink"/>
@@ -5524,8 +6285,8 @@
         <w:t xml:space="preserve">.</w:t>
       </w:r>
     </w:p>
-    <w:bookmarkEnd w:id="71"/>
-    <w:bookmarkStart w:id="72" w:name="ref-crewai_docs"/>
+    <w:bookmarkEnd w:id="78"/>
+    <w:bookmarkStart w:id="79" w:name="ref-crewai_docs"/>
     <w:p>
       <w:pPr>
         <w:pStyle w:val="Bibliography"/>
@@ -5549,7 +6310,7 @@
       <w:r>
         <w:t xml:space="preserve"> </w:t>
       </w:r>
-      <w:hyperlink r:id="rId47">
+      <w:hyperlink r:id="rId54">
         <w:r>
           <w:rPr>
             <w:rStyle w:val="Hyperlink"/>
@@ -5561,8 +6322,8 @@
         <w:t xml:space="preserve">.</w:t>
       </w:r>
     </w:p>
-    <w:bookmarkEnd w:id="72"/>
-    <w:bookmarkStart w:id="73" w:name="ref-metagpt"/>
+    <w:bookmarkEnd w:id="79"/>
+    <w:bookmarkStart w:id="80" w:name="ref-metagpt"/>
     <w:p>
       <w:pPr>
         <w:pStyle w:val="Bibliography"/>
@@ -5586,7 +6347,7 @@
       <w:r>
         <w:t xml:space="preserve"> </w:t>
       </w:r>
-      <w:hyperlink r:id="rId59">
+      <w:hyperlink r:id="rId66">
         <w:r>
           <w:rPr>
             <w:rStyle w:val="Hyperlink"/>
@@ -5598,8 +6359,8 @@
         <w:t xml:space="preserve">.</w:t>
       </w:r>
     </w:p>
-    <w:bookmarkEnd w:id="73"/>
-    <w:bookmarkStart w:id="74" w:name="ref-google_adk"/>
+    <w:bookmarkEnd w:id="80"/>
+    <w:bookmarkStart w:id="81" w:name="ref-google_adk"/>
     <w:p>
       <w:pPr>
         <w:pStyle w:val="Bibliography"/>
@@ -5623,7 +6384,7 @@
       <w:r>
         <w:t xml:space="preserve"> </w:t>
       </w:r>
-      <w:hyperlink r:id="rId55">
+      <w:hyperlink r:id="rId62">
         <w:r>
           <w:rPr>
             <w:rStyle w:val="Hyperlink"/>
@@ -5635,8 +6396,8 @@
         <w:t xml:space="preserve">.</w:t>
       </w:r>
     </w:p>
-    <w:bookmarkEnd w:id="74"/>
-    <w:bookmarkStart w:id="75" w:name="ref-smolagents"/>
+    <w:bookmarkEnd w:id="81"/>
+    <w:bookmarkStart w:id="82" w:name="ref-smolagents"/>
     <w:p>
       <w:pPr>
         <w:pStyle w:val="Bibliography"/>
@@ -5660,7 +6421,7 @@
       <w:r>
         <w:t xml:space="preserve"> </w:t>
       </w:r>
-      <w:hyperlink r:id="rId61">
+      <w:hyperlink r:id="rId68">
         <w:r>
           <w:rPr>
             <w:rStyle w:val="Hyperlink"/>
@@ -5672,8 +6433,8 @@
         <w:t xml:space="preserve">.</w:t>
       </w:r>
     </w:p>
-    <w:bookmarkEnd w:id="75"/>
-    <w:bookmarkStart w:id="76" w:name="ref-inflexa"/>
+    <w:bookmarkEnd w:id="82"/>
+    <w:bookmarkStart w:id="83" w:name="ref-inflexa"/>
     <w:p>
       <w:pPr>
         <w:pStyle w:val="Bibliography"/>
@@ -5709,8 +6470,8 @@
         <w:t xml:space="preserve">.</w:t>
       </w:r>
     </w:p>
-    <w:bookmarkEnd w:id="76"/>
-    <w:bookmarkStart w:id="78" w:name="ref-langgraph_repo"/>
+    <w:bookmarkEnd w:id="83"/>
+    <w:bookmarkStart w:id="85" w:name="ref-langgraph_repo"/>
     <w:p>
       <w:pPr>
         <w:pStyle w:val="Bibliography"/>
@@ -5734,7 +6495,7 @@
       <w:r>
         <w:t xml:space="preserve"> </w:t>
       </w:r>
-      <w:hyperlink r:id="rId77">
+      <w:hyperlink r:id="rId84">
         <w:r>
           <w:rPr>
             <w:rStyle w:val="Hyperlink"/>
@@ -5746,8 +6507,8 @@
         <w:t xml:space="preserve">.</w:t>
       </w:r>
     </w:p>
-    <w:bookmarkEnd w:id="78"/>
-    <w:bookmarkStart w:id="79" w:name="ref-langgraph_docs"/>
+    <w:bookmarkEnd w:id="85"/>
+    <w:bookmarkStart w:id="86" w:name="ref-langgraph_docs"/>
     <w:p>
       <w:pPr>
         <w:pStyle w:val="Bibliography"/>
@@ -5771,7 +6532,7 @@
       <w:r>
         <w:t xml:space="preserve"> </w:t>
       </w:r>
-      <w:hyperlink r:id="rId43">
+      <w:hyperlink r:id="rId50">
         <w:r>
           <w:rPr>
             <w:rStyle w:val="Hyperlink"/>
@@ -5783,8 +6544,8 @@
         <w:t xml:space="preserve">.</w:t>
       </w:r>
     </w:p>
-    <w:bookmarkEnd w:id="79"/>
-    <w:bookmarkStart w:id="80" w:name="ref-llama_index"/>
+    <w:bookmarkEnd w:id="86"/>
+    <w:bookmarkStart w:id="87" w:name="ref-llama_index"/>
     <w:p>
       <w:pPr>
         <w:pStyle w:val="Bibliography"/>
@@ -5808,7 +6569,7 @@
       <w:r>
         <w:t xml:space="preserve"> </w:t>
       </w:r>
-      <w:hyperlink r:id="rId60">
+      <w:hyperlink r:id="rId67">
         <w:r>
           <w:rPr>
             <w:rStyle w:val="Hyperlink"/>
@@ -5820,8 +6581,8 @@
         <w:t xml:space="preserve">.</w:t>
       </w:r>
     </w:p>
-    <w:bookmarkEnd w:id="80"/>
-    <w:bookmarkStart w:id="82" w:name="ref-autogen_teams"/>
+    <w:bookmarkEnd w:id="87"/>
+    <w:bookmarkStart w:id="89" w:name="ref-autogen_teams"/>
     <w:p>
       <w:pPr>
         <w:pStyle w:val="Bibliography"/>
@@ -5845,7 +6606,7 @@
       <w:r>
         <w:t xml:space="preserve"> </w:t>
       </w:r>
-      <w:hyperlink r:id="rId81">
+      <w:hyperlink r:id="rId88">
         <w:r>
           <w:rPr>
             <w:rStyle w:val="Hyperlink"/>
@@ -5857,8 +6618,8 @@
         <w:t xml:space="preserve">.</w:t>
       </w:r>
     </w:p>
-    <w:bookmarkEnd w:id="82"/>
-    <w:bookmarkStart w:id="83" w:name="ref-autogen_docs"/>
+    <w:bookmarkEnd w:id="89"/>
+    <w:bookmarkStart w:id="90" w:name="ref-autogen_docs"/>
     <w:p>
       <w:pPr>
         <w:pStyle w:val="Bibliography"/>
@@ -5882,7 +6643,7 @@
       <w:r>
         <w:t xml:space="preserve"> </w:t>
       </w:r>
-      <w:hyperlink r:id="rId35">
+      <w:hyperlink r:id="rId42">
         <w:r>
           <w:rPr>
             <w:rStyle w:val="Hyperlink"/>
@@ -5894,8 +6655,8 @@
         <w:t xml:space="preserve">.</w:t>
       </w:r>
     </w:p>
-    <w:bookmarkEnd w:id="83"/>
-    <w:bookmarkStart w:id="85" w:name="ref-autogen_repo"/>
+    <w:bookmarkEnd w:id="90"/>
+    <w:bookmarkStart w:id="92" w:name="ref-autogen_repo"/>
     <w:p>
       <w:pPr>
         <w:pStyle w:val="Bibliography"/>
@@ -5919,7 +6680,7 @@
       <w:r>
         <w:t xml:space="preserve"> </w:t>
       </w:r>
-      <w:hyperlink r:id="rId84">
+      <w:hyperlink r:id="rId91">
         <w:r>
           <w:rPr>
             <w:rStyle w:val="Hyperlink"/>
@@ -5931,8 +6692,8 @@
         <w:t xml:space="preserve">.</w:t>
       </w:r>
     </w:p>
-    <w:bookmarkEnd w:id="85"/>
-    <w:bookmarkStart w:id="86" w:name="ref-microsoft_agent_framework"/>
+    <w:bookmarkEnd w:id="92"/>
+    <w:bookmarkStart w:id="93" w:name="ref-microsoft_agent_framework"/>
     <w:p>
       <w:pPr>
         <w:pStyle w:val="Bibliography"/>
@@ -5956,7 +6717,7 @@
       <w:r>
         <w:t xml:space="preserve"> </w:t>
       </w:r>
-      <w:hyperlink r:id="rId39">
+      <w:hyperlink r:id="rId46">
         <w:r>
           <w:rPr>
             <w:rStyle w:val="Hyperlink"/>
@@ -5968,8 +6729,8 @@
         <w:t xml:space="preserve">.</w:t>
       </w:r>
     </w:p>
-    <w:bookmarkEnd w:id="86"/>
-    <w:bookmarkStart w:id="87" w:name="ref-openai_agents_sdk"/>
+    <w:bookmarkEnd w:id="93"/>
+    <w:bookmarkStart w:id="94" w:name="ref-openai_agents_sdk"/>
     <w:p>
       <w:pPr>
         <w:pStyle w:val="Bibliography"/>
@@ -5993,7 +6754,7 @@
       <w:r>
         <w:t xml:space="preserve"> </w:t>
       </w:r>
-      <w:hyperlink r:id="rId51">
+      <w:hyperlink r:id="rId58">
         <w:r>
           <w:rPr>
             <w:rStyle w:val="Hyperlink"/>
@@ -6005,8 +6766,8 @@
         <w:t xml:space="preserve">.</w:t>
       </w:r>
     </w:p>
-    <w:bookmarkEnd w:id="87"/>
-    <w:bookmarkStart w:id="88" w:name="ref-torqclaw"/>
+    <w:bookmarkEnd w:id="94"/>
+    <w:bookmarkStart w:id="95" w:name="ref-torqclaw"/>
     <w:p>
       <w:pPr>
         <w:pStyle w:val="Bibliography"/>
@@ -6045,8 +6806,8 @@
         <w:t xml:space="preserve">.</w:t>
       </w:r>
     </w:p>
-    <w:bookmarkEnd w:id="88"/>
-    <w:bookmarkStart w:id="89" w:name="ref-pydantic_ai"/>
+    <w:bookmarkEnd w:id="95"/>
+    <w:bookmarkStart w:id="96" w:name="ref-pydantic_ai"/>
     <w:p>
       <w:pPr>
         <w:pStyle w:val="Bibliography"/>
@@ -6070,7 +6831,7 @@
       <w:r>
         <w:t xml:space="preserve"> </w:t>
       </w:r>
-      <w:hyperlink r:id="rId62">
+      <w:hyperlink r:id="rId69">
         <w:r>
           <w:rPr>
             <w:rStyle w:val="Hyperlink"/>
@@ -6082,9 +6843,9 @@
         <w:t xml:space="preserve">.</w:t>
       </w:r>
     </w:p>
-    <w:bookmarkEnd w:id="89"/>
-    <w:bookmarkEnd w:id="90"/>
-    <w:bookmarkEnd w:id="91"/>
+    <w:bookmarkEnd w:id="96"/>
+    <w:bookmarkEnd w:id="97"/>
+    <w:bookmarkEnd w:id="98"/>
     <w:sectPr>
       <w:footnotePr>
         <w:numRestart w:val="eachSect"/>
@@ -6314,6 +7075,12 @@
     <w:abstractNumId w:val="991"/>
   </w:num>
   <w:num w:numId="1005">
+    <w:abstractNumId w:val="991"/>
+  </w:num>
+  <w:num w:numId="1006">
+    <w:abstractNumId w:val="991"/>
+  </w:num>
+  <w:num w:numId="1007">
     <w:abstractNumId w:val="991"/>
   </w:num>
 </w:numbering>

</xml_diff>